<commit_message>
docs(fase2): evidencias individuales de Jossue Padron y correccion en la 2.4
2.1 Diario de Reflexion Fase 2, sobre la plantilla oficial. Responde las
seis preguntas en primera persona.

2.2 Autoevaluacion: se marca el nivel en cada uno de los ocho
indicadores, sombreando la celda. Queda en No logrado el indicador del
abstract, las conclusiones y la reflexion en ingles, porque aun no estan
redactados.

Correccion en la 2.4: decia que la deteccion de recurrencias estaba "No
iniciado" y es falso. La ingesta ya la detecta por frecuencia mensual y
marca 111 de 263 movimientos; la app filtra gasto fijo y variable con
esa marca. Pasa a "En curso": falta la tolerancia a variacion de monto y
fecha, y la entidad de suscripcion confirmable por el usuario. Un dato
equivocado en un informe entregado es peor que una actividad atrasada.
</commit_message>
<xml_diff>
--- a/Fase 2/Evidencias_Grupales/2.4_GuiaEstudiante_Fase 2_DesarrolloProyecto APT.docx
+++ b/Fase 2/Evidencias_Grupales/2.4_GuiaEstudiante_Fase 2_DesarrolloProyecto APT.docx
@@ -800,58 +800,58 @@
               <w:rPr>
                 <w:b w:val="0"/>
               </w:rPr>
-              <w:t>OE-6 (cumplimiento de la Ley 21.719): iniciado antes de lo planificado. Está operativo el consentimiento específico por finalidad de tratamiento, con vigencia, revocación y registro histórico.</w:t>
-            </w:r>
-          </w:p>
-          <w:p>
-            <w:pPr>
-              <w:jc w:val="both"/>
-              <w:rPr>
-                <w:rFonts w:ascii="Calibri" w:hAnsi="Calibri" w:cs="Arial"/>
-                <w:i/>
-                <w:color w:val="548DD4"/>
-                <w:sz w:val="20"/>
-                <w:szCs w:val="20"/>
-                <w:lang w:eastAsia="es-CL"/>
-              </w:rPr>
-            </w:pPr>
-          </w:p>
-          <w:p>
-            <w:pPr>
-              <w:jc w:val="both"/>
-              <w:rPr>
-                <w:rFonts w:ascii="Calibri" w:hAnsi="Calibri" w:cs="Arial"/>
-                <w:i/>
-                <w:color w:val="548DD4"/>
-                <w:sz w:val="20"/>
-                <w:szCs w:val="20"/>
-                <w:lang w:eastAsia="es-CL"/>
-              </w:rPr>
-            </w:pPr>
-            <w:r>
-              <w:rPr>
-                <w:b/>
-              </w:rPr>
-              <w:t>Objetivo específico no iniciado</w:t>
-            </w:r>
-          </w:p>
-          <w:p>
-            <w:pPr>
-              <w:jc w:val="both"/>
-              <w:rPr>
-                <w:rFonts w:ascii="Calibri" w:hAnsi="Calibri" w:cs="Arial"/>
-                <w:i/>
-                <w:color w:val="548DD4"/>
-                <w:sz w:val="20"/>
-                <w:szCs w:val="20"/>
-                <w:lang w:eastAsia="es-CL"/>
-              </w:rPr>
-            </w:pPr>
-            <w:r>
-              <w:rPr>
-                <w:b w:val="0"/>
-              </w:rPr>
-              <w:t>OE-4 (detección de gastos recurrentes): planificado para las semanas 10 y 11. Es la única actividad del compromiso base que no ha comenzado.</w:t>
+              <w:t>OE-4 (detección de gastos recurrentes): adelantado y parcialmente cumplido. La ingesta ya identifica los cargos recurrentes por frecuencia mensual y marca los movimientos: 111 de 263 quedaron clasificados como recurrentes, y la aplicación permite filtrar entre gasto fijo y variable usando esa marca. Falta la parte del objetivo que exige tolerancia a variaciones de monto, desplazamiento de fecha y cambios en la glosa, y falta poblar la entidad de suscripción, que debe permitir al usuario confirmar o descartar cada recurrencia detectada.</w:t>
+            </w:r>
+          </w:p>
+          <w:p>
+            <w:pPr>
+              <w:jc w:val="both"/>
+              <w:rPr>
+                <w:rFonts w:ascii="Calibri" w:hAnsi="Calibri" w:cs="Arial"/>
+                <w:i/>
+                <w:color w:val="548DD4"/>
+                <w:sz w:val="20"/>
+                <w:szCs w:val="20"/>
+                <w:lang w:eastAsia="es-CL"/>
+              </w:rPr>
+            </w:pPr>
+            <w:r>
+              <w:rPr>
+                <w:b w:val="0"/>
+              </w:rPr>
+              <w:t>OE-6 (cumplimiento de la Ley 21.719): iniciado antes de lo planificado. Están operativos la revocación del consentimiento bancario con eliminación de los datos asociados, y el consentimiento específico por finalidad de tratamiento, con vigencia, revocación y registro histórico.</w:t>
+            </w:r>
+          </w:p>
+          <w:p>
+            <w:pPr>
+              <w:jc w:val="both"/>
+              <w:rPr>
+                <w:rFonts w:ascii="Calibri" w:hAnsi="Calibri" w:cs="Arial"/>
+                <w:i/>
+                <w:color w:val="548DD4"/>
+                <w:sz w:val="20"/>
+                <w:szCs w:val="20"/>
+                <w:lang w:eastAsia="es-CL"/>
+              </w:rPr>
+            </w:pPr>
+          </w:p>
+          <w:p>
+            <w:pPr>
+              <w:jc w:val="both"/>
+              <w:rPr>
+                <w:rFonts w:ascii="Calibri" w:hAnsi="Calibri" w:cs="Arial"/>
+                <w:i/>
+                <w:color w:val="548DD4"/>
+                <w:sz w:val="20"/>
+                <w:szCs w:val="20"/>
+                <w:lang w:eastAsia="es-CL"/>
+              </w:rPr>
+            </w:pPr>
+            <w:r>
+              <w:rPr>
+                <w:b w:val="0"/>
+              </w:rPr>
+              <w:t>Al cierre de la semana 9 no hay objetivos específicos sin iniciar. Los seis están cumplidos o en curso.</w:t>
             </w:r>
           </w:p>
         </w:tc>
@@ -2959,7 +2959,7 @@
                 <w:b w:val="0"/>
                 <w:sz w:val="16"/>
               </w:rPr>
-              <w:t>Es un algoritmo autocontenido, sin dependencias de infraestructura y probable con datos sintéticos.</w:t>
+              <w:t>Facilitador: es un algoritmo autocontenido, sin dependencias de infraestructura y probable con datos sintéticos.</w:t>
             </w:r>
           </w:p>
         </w:tc>
@@ -2984,7 +2984,7 @@
                 <w:b w:val="0"/>
                 <w:sz w:val="16"/>
               </w:rPr>
-              <w:t>No iniciado</w:t>
+              <w:t>En curso</w:t>
             </w:r>
           </w:p>
         </w:tc>
@@ -3009,7 +3009,7 @@
                 <w:b w:val="0"/>
                 <w:sz w:val="16"/>
               </w:rPr>
-              <w:t>Reasignada de Jossue Padrón a Pedro Torres para equilibrar la carga. Ver sección 3.</w:t>
+              <w:t>Adelantada: la primera versión por frecuencia mensual ya opera dentro de la ingesta. Falta la tolerancia a variación de monto y fecha, y la entidad de suscripción confirmable por el usuario.</w:t>
             </w:r>
           </w:p>
         </w:tc>
@@ -4389,28 +4389,60 @@
             </w:pPr>
             <w:r>
               <w:rPr>
+                <w:b w:val="0"/>
+              </w:rPr>
+              <w:t>Al cierre de la semana 9 ninguna actividad del plan está sin iniciar. Hay una con retraso y dos con avance parcial respecto de lo que exige su objetivo.</w:t>
+            </w:r>
+          </w:p>
+          <w:p>
+            <w:pPr>
+              <w:jc w:val="both"/>
+              <w:rPr>
+                <w:rFonts w:ascii="Calibri" w:hAnsi="Calibri" w:cs="Arial"/>
+                <w:i/>
+                <w:color w:val="548DD4"/>
+                <w:sz w:val="20"/>
+                <w:szCs w:val="20"/>
+                <w:lang w:eastAsia="es-CL"/>
+              </w:rPr>
+            </w:pPr>
+          </w:p>
+          <w:p>
+            <w:pPr>
+              <w:jc w:val="both"/>
+              <w:rPr>
+                <w:rFonts w:ascii="Calibri" w:hAnsi="Calibri" w:cs="Arial"/>
+                <w:i/>
+                <w:color w:val="548DD4"/>
+                <w:sz w:val="20"/>
+                <w:szCs w:val="20"/>
+                <w:lang w:eastAsia="es-CL"/>
+              </w:rPr>
+            </w:pPr>
+            <w:r>
+              <w:rPr>
                 <w:b/>
               </w:rPr>
-              <w:t>No iniciada: detección de gastos recurrentes y suscripciones (semanas 10 y 11).</w:t>
-            </w:r>
-          </w:p>
-          <w:p>
-            <w:pPr>
-              <w:jc w:val="both"/>
-              <w:rPr>
-                <w:rFonts w:ascii="Calibri" w:hAnsi="Calibri" w:cs="Arial"/>
-                <w:i/>
-                <w:color w:val="548DD4"/>
-                <w:sz w:val="20"/>
-                <w:szCs w:val="20"/>
-                <w:lang w:eastAsia="es-CL"/>
-              </w:rPr>
-            </w:pPr>
-            <w:r>
-              <w:rPr>
-                <w:b w:val="0"/>
-              </w:rPr>
-              <w:t>Motivo: la actividad está planificada para iniciarse en la semana 10, de modo que al cierre de este informe no presenta retraso respecto del plan. Se consigna porque es la única capa del compromiso base que aún no comienza. Estrategia: se reasigna a Pedro Torres por tratarse de un algoritmo autocontenido, sin dependencias de infraestructura y probable con datos sintéticos, lo que permite desarrollarla en paralelo con el resto del sistema.</w:t>
+              <w:t>Retrasada: integración del clasificador automático (semanas 8 a 10).</w:t>
+            </w:r>
+          </w:p>
+          <w:p>
+            <w:pPr>
+              <w:jc w:val="both"/>
+              <w:rPr>
+                <w:rFonts w:ascii="Calibri" w:hAnsi="Calibri" w:cs="Arial"/>
+                <w:i/>
+                <w:color w:val="548DD4"/>
+                <w:sz w:val="20"/>
+                <w:szCs w:val="20"/>
+                <w:lang w:eastAsia="es-CL"/>
+              </w:rPr>
+            </w:pPr>
+            <w:r>
+              <w:rPr>
+                <w:b w:val="0"/>
+              </w:rPr>
+              <w:t>Motivo: el modelo fue construido y medido dentro del plazo, pero no se incorporó al repositorio a tiempo, por lo que la integración con el backend y la aplicación quedó pendiente. Estrategia: la interfaz que lo expone ya está construida y el contrato de datos ya contempla los campos necesarios, de manera que la integración se reduce a poblar dos campos desde el backend. Se fija como primera tarea de Pedro Torres en la redistribución acordada, por ser quien desarrolló el modelo.</w:t>
             </w:r>
           </w:p>
           <w:p>
@@ -4442,26 +4474,77 @@
               <w:rPr>
                 <w:b/>
               </w:rPr>
-              <w:t>Retrasada: integración del clasificador automático (semanas 8 a 10).</w:t>
-            </w:r>
-          </w:p>
-          <w:p>
-            <w:pPr>
-              <w:jc w:val="both"/>
-              <w:rPr>
-                <w:rFonts w:ascii="Calibri" w:hAnsi="Calibri" w:cs="Arial"/>
-                <w:i/>
-                <w:color w:val="548DD4"/>
-                <w:sz w:val="20"/>
-                <w:szCs w:val="20"/>
-                <w:lang w:eastAsia="es-CL"/>
-              </w:rPr>
-            </w:pPr>
-            <w:r>
-              <w:rPr>
-                <w:b w:val="0"/>
-              </w:rPr>
-              <w:t>Motivo: el modelo fue construido y medido dentro del plazo, pero no se incorporó al repositorio a tiempo, por lo que la integración con el backend y la aplicación quedó pendiente. Estrategia: la interfaz que lo expone ya está construida y el contrato de datos ya contempla los campos necesarios, de manera que la integración se reduce a poblar dos campos desde el backend. Se fija como primera tarea de Pedro Torres en la redistribución acordada, por ser quien desarrolló el modelo.</w:t>
+              <w:t>Avance parcial: detección de gastos recurrentes (semanas 10 y 11).</w:t>
+            </w:r>
+          </w:p>
+          <w:p>
+            <w:pPr>
+              <w:jc w:val="both"/>
+              <w:rPr>
+                <w:rFonts w:ascii="Calibri" w:hAnsi="Calibri" w:cs="Arial"/>
+                <w:i/>
+                <w:color w:val="548DD4"/>
+                <w:sz w:val="20"/>
+                <w:szCs w:val="20"/>
+                <w:lang w:eastAsia="es-CL"/>
+              </w:rPr>
+            </w:pPr>
+            <w:r>
+              <w:rPr>
+                <w:b w:val="0"/>
+              </w:rPr>
+              <w:t>La actividad se adelantó y su primera versión ya opera: la ingesta marca los cargos que se repiten mes a mes y la aplicación filtra entre gasto fijo y variable con esa marca. Lo que falta es lo que distingue al objetivo de una heurística simple: tolerancia a variaciones de monto, a desplazamientos de fecha y a cambios en la glosa del comercio, además de la entidad de suscripción que el usuario pueda confirmar o descartar. Estrategia: se completa dentro de su ventana original, a cargo de Pedro Torres.</w:t>
+            </w:r>
+          </w:p>
+          <w:p>
+            <w:pPr>
+              <w:jc w:val="both"/>
+              <w:rPr>
+                <w:rFonts w:ascii="Calibri" w:hAnsi="Calibri" w:cs="Arial"/>
+                <w:i/>
+                <w:color w:val="548DD4"/>
+                <w:sz w:val="20"/>
+                <w:szCs w:val="20"/>
+                <w:lang w:eastAsia="es-CL"/>
+              </w:rPr>
+            </w:pPr>
+          </w:p>
+          <w:p>
+            <w:pPr>
+              <w:jc w:val="both"/>
+              <w:rPr>
+                <w:rFonts w:ascii="Calibri" w:hAnsi="Calibri" w:cs="Arial"/>
+                <w:i/>
+                <w:color w:val="548DD4"/>
+                <w:sz w:val="20"/>
+                <w:szCs w:val="20"/>
+                <w:lang w:eastAsia="es-CL"/>
+              </w:rPr>
+            </w:pPr>
+            <w:r>
+              <w:rPr>
+                <w:b/>
+              </w:rPr>
+              <w:t>Avance parcial: seguridad avanzada del estándar SFA.</w:t>
+            </w:r>
+          </w:p>
+          <w:p>
+            <w:pPr>
+              <w:jc w:val="both"/>
+              <w:rPr>
+                <w:rFonts w:ascii="Calibri" w:hAnsi="Calibri" w:cs="Arial"/>
+                <w:i/>
+                <w:color w:val="548DD4"/>
+                <w:sz w:val="20"/>
+                <w:szCs w:val="20"/>
+                <w:lang w:eastAsia="es-CL"/>
+              </w:rPr>
+            </w:pPr>
+            <w:r>
+              <w:rPr>
+                <w:b w:val="0"/>
+              </w:rPr>
+              <w:t>Se decidió implementar primero el flujo de consentimiento completo y verificable, y postergar las capas de autenticación mutua por certificado, firma JWS y registro dinámico de clientes. Estrategia: quedan declaradas fuera del alcance comprometido, por no poder ejercitarse de forma significativa contra un simulador construido por el propio equipo.</w:t>
             </w:r>
           </w:p>
           <w:p>

</xml_diff>